<commit_message>
English version of release notes
</commit_message>
<xml_diff>
--- a/Documentation/Official Documentation/Release Notes/Release Notes for IBOS MusicXmlReader version 4.0.0.0.docx
+++ b/Documentation/Official Documentation/Release Notes/Release Notes for IBOS MusicXmlReader version 4.0.0.0.docx
@@ -74,6 +74,280 @@
           <w:rFonts w:cs="Arial" w:ascii="Arial" w:hAnsi="Arial"/>
           <w:bCs/>
         </w:rPr>
+        <w:t>Export of Braille Music in BANA 2015 format using interval-notation and In-Accord notation.</w:t>
+      </w:r>
+    </w:p>
+    <w:p>
+      <w:pPr>
+        <w:pStyle w:val="Normal"/>
+        <w:numPr>
+          <w:ilvl w:val="0"/>
+          <w:numId w:val="1"/>
+        </w:numPr>
+        <w:spacing w:lineRule="auto" w:line="252"/>
+        <w:rPr>
+          <w:rFonts w:ascii="Arial" w:hAnsi="Arial" w:cs="Arial"/>
+          <w:bCs/>
+        </w:rPr>
+      </w:pPr>
+      <w:r>
+        <w:rPr>
+          <w:rFonts w:cs="Arial" w:ascii="Arial" w:hAnsi="Arial"/>
+          <w:bCs/>
+        </w:rPr>
+        <w:t>A new “profile” concept allows the user to set up the properties for his embossers and note-taker devices once and for all.</w:t>
+      </w:r>
+    </w:p>
+    <w:p>
+      <w:pPr>
+        <w:pStyle w:val="Normal"/>
+        <w:numPr>
+          <w:ilvl w:val="0"/>
+          <w:numId w:val="1"/>
+        </w:numPr>
+        <w:spacing w:lineRule="auto" w:line="252"/>
+        <w:rPr>
+          <w:rFonts w:ascii="Arial" w:hAnsi="Arial" w:cs="Arial"/>
+          <w:bCs/>
+        </w:rPr>
+      </w:pPr>
+      <w:r>
+        <w:rPr>
+          <w:rFonts w:cs="Arial" w:ascii="Arial" w:hAnsi="Arial"/>
+          <w:bCs/>
+        </w:rPr>
+        <w:t>Extended support of Braille Music for SATB choir arrangements by generated a right hand file for Soprano and Alto and a left hand file for Bas end Tenor.</w:t>
+      </w:r>
+    </w:p>
+    <w:p>
+      <w:pPr>
+        <w:pStyle w:val="Normal"/>
+        <w:numPr>
+          <w:ilvl w:val="0"/>
+          <w:numId w:val="1"/>
+        </w:numPr>
+        <w:spacing w:lineRule="auto" w:line="252"/>
+        <w:rPr>
+          <w:rFonts w:ascii="Arial" w:hAnsi="Arial" w:cs="Arial"/>
+          <w:bCs/>
+        </w:rPr>
+      </w:pPr>
+      <w:r>
+        <w:rPr>
+          <w:rFonts w:cs="Arial" w:ascii="Arial" w:hAnsi="Arial"/>
+          <w:bCs/>
+        </w:rPr>
+        <w:t>Direct embossing of Braille Music files generated using a Windows Print-dialog</w:t>
+      </w:r>
+      <w:r>
+        <w:rPr>
+          <w:rFonts w:cs="Arial" w:ascii="Arial" w:hAnsi="Arial"/>
+          <w:bCs/>
+        </w:rPr>
+        <w:t>ue</w:t>
+      </w:r>
+      <w:r>
+        <w:rPr>
+          <w:rFonts w:cs="Arial" w:ascii="Arial" w:hAnsi="Arial"/>
+          <w:bCs/>
+        </w:rPr>
+        <w:t xml:space="preserve">. </w:t>
+      </w:r>
+      <w:r>
+        <w:rPr>
+          <w:rFonts w:cs="Arial" w:ascii="Arial" w:hAnsi="Arial"/>
+          <w:bCs/>
+        </w:rPr>
+        <w:t>To be preferred when the embosser can be registered as a Windows printer.</w:t>
+      </w:r>
+    </w:p>
+    <w:p>
+      <w:pPr>
+        <w:pStyle w:val="Normal"/>
+        <w:numPr>
+          <w:ilvl w:val="0"/>
+          <w:numId w:val="1"/>
+        </w:numPr>
+        <w:spacing w:lineRule="auto" w:line="252"/>
+        <w:rPr>
+          <w:rFonts w:ascii="Arial" w:hAnsi="Arial" w:cs="Arial"/>
+          <w:bCs/>
+        </w:rPr>
+      </w:pPr>
+      <w:r>
+        <w:rPr>
+          <w:rFonts w:cs="Arial" w:ascii="Arial" w:hAnsi="Arial"/>
+          <w:bCs/>
+        </w:rPr>
+        <w:t>Indirect embossing of Braille Music files generated through the printer controller program delivered by the supplier of the embosser. Only to be used if the embosser can NOT be registered as a Windows printer.</w:t>
+      </w:r>
+    </w:p>
+    <w:p>
+      <w:pPr>
+        <w:pStyle w:val="Normal"/>
+        <w:numPr>
+          <w:ilvl w:val="0"/>
+          <w:numId w:val="1"/>
+        </w:numPr>
+        <w:spacing w:lineRule="auto" w:line="252"/>
+        <w:rPr>
+          <w:rFonts w:ascii="Arial" w:hAnsi="Arial" w:cs="Arial"/>
+          <w:bCs/>
+        </w:rPr>
+      </w:pPr>
+      <w:r>
+        <w:rPr>
+          <w:rFonts w:cs="Arial" w:ascii="Arial" w:hAnsi="Arial"/>
+          <w:bCs/>
+        </w:rPr>
+        <w:t>Support for copying of Braille Music files generated to a note-taker device using Windows Explorer.</w:t>
+      </w:r>
+    </w:p>
+    <w:p>
+      <w:pPr>
+        <w:pStyle w:val="Normal"/>
+        <w:numPr>
+          <w:ilvl w:val="0"/>
+          <w:numId w:val="1"/>
+        </w:numPr>
+        <w:spacing w:lineRule="auto" w:line="252"/>
+        <w:rPr>
+          <w:rFonts w:ascii="Arial" w:hAnsi="Arial" w:cs="Arial"/>
+          <w:bCs/>
+        </w:rPr>
+      </w:pPr>
+      <w:r>
+        <w:rPr>
+          <w:rFonts w:cs="Arial" w:ascii="Arial" w:hAnsi="Arial"/>
+          <w:bCs/>
+        </w:rPr>
+        <w:t>Support for user-specific setup of paths to standard note-editor programs “Sibelius”, “MuseScore”, “Capella ” and “Finale NotePad”.</w:t>
+      </w:r>
+    </w:p>
+    <w:p>
+      <w:pPr>
+        <w:pStyle w:val="Normal"/>
+        <w:numPr>
+          <w:ilvl w:val="0"/>
+          <w:numId w:val="1"/>
+        </w:numPr>
+        <w:spacing w:lineRule="auto" w:line="252"/>
+        <w:rPr>
+          <w:rFonts w:ascii="Arial" w:hAnsi="Arial" w:cs="Arial"/>
+          <w:bCs/>
+        </w:rPr>
+      </w:pPr>
+      <w:r>
+        <w:rPr>
+          <w:rFonts w:cs="Arial" w:ascii="Arial" w:hAnsi="Arial"/>
+          <w:bCs/>
+        </w:rPr>
+        <w:t>Support for user-specific setup of path tu supplier-specific printer control program.</w:t>
+      </w:r>
+    </w:p>
+    <w:p>
+      <w:pPr>
+        <w:pStyle w:val="Normal"/>
+        <w:numPr>
+          <w:ilvl w:val="0"/>
+          <w:numId w:val="1"/>
+        </w:numPr>
+        <w:spacing w:lineRule="auto" w:line="252"/>
+        <w:rPr>
+          <w:rFonts w:ascii="Arial" w:hAnsi="Arial" w:cs="Arial"/>
+          <w:bCs/>
+        </w:rPr>
+      </w:pPr>
+      <w:r>
+        <w:rPr>
+          <w:rFonts w:cs="Arial" w:ascii="Arial" w:hAnsi="Arial"/>
+          <w:bCs/>
+        </w:rPr>
+        <w:t>User-specific saving of path to most recently opened MusicXml file and to most rently generated Braille Music files.</w:t>
+      </w:r>
+    </w:p>
+    <w:p>
+      <w:pPr>
+        <w:pStyle w:val="Normal"/>
+        <w:numPr>
+          <w:ilvl w:val="0"/>
+          <w:numId w:val="1"/>
+        </w:numPr>
+        <w:spacing w:lineRule="auto" w:line="252"/>
+        <w:rPr>
+          <w:rFonts w:ascii="Arial" w:hAnsi="Arial" w:cs="Arial"/>
+          <w:bCs/>
+        </w:rPr>
+      </w:pPr>
+      <w:r>
+        <w:rPr>
+          <w:rFonts w:cs="Arial" w:ascii="Arial" w:hAnsi="Arial"/>
+          <w:bCs/>
+        </w:rPr>
+        <w:t xml:space="preserve">Better functionality of “Full measure information” (also known as the “where am I” function), now showing measure number and beat number within the beat. </w:t>
+      </w:r>
+    </w:p>
+    <w:p>
+      <w:pPr>
+        <w:pStyle w:val="Normal"/>
+        <w:numPr>
+          <w:ilvl w:val="0"/>
+          <w:numId w:val="1"/>
+        </w:numPr>
+        <w:spacing w:lineRule="auto" w:line="252"/>
+        <w:rPr>
+          <w:rFonts w:ascii="Arial" w:hAnsi="Arial" w:cs="Arial"/>
+          <w:bCs/>
+        </w:rPr>
+      </w:pPr>
+      <w:r>
+        <w:rPr>
+          <w:rFonts w:cs="Arial" w:ascii="Arial" w:hAnsi="Arial"/>
+          <w:bCs/>
+        </w:rPr>
+        <w:t>Localization to Dutch.</w:t>
+      </w:r>
+    </w:p>
+    <w:p>
+      <w:pPr>
+        <w:pStyle w:val="Normal"/>
+        <w:numPr>
+          <w:ilvl w:val="0"/>
+          <w:numId w:val="1"/>
+        </w:numPr>
+        <w:spacing w:lineRule="auto" w:line="252"/>
+        <w:rPr>
+          <w:rFonts w:ascii="Arial" w:hAnsi="Arial" w:cs="Arial"/>
+          <w:bCs/>
+        </w:rPr>
+      </w:pPr>
+      <w:r>
+        <w:rPr>
+          <w:rFonts w:cs="Arial" w:ascii="Arial" w:hAnsi="Arial"/>
+          <w:bCs/>
+        </w:rPr>
+        <w:t>Fix of several minor errors, reported by the users.</w:t>
+      </w:r>
+    </w:p>
+    <w:p>
+      <w:pPr>
+        <w:pStyle w:val="Normal"/>
+        <w:numPr>
+          <w:ilvl w:val="0"/>
+          <w:numId w:val="1"/>
+        </w:numPr>
+        <w:spacing w:lineRule="auto" w:line="252"/>
+        <w:rPr>
+          <w:rFonts w:ascii="Arial" w:hAnsi="Arial" w:cs="Arial"/>
+          <w:bCs/>
+        </w:rPr>
+      </w:pPr>
+      <w:r>
+        <w:rPr>
+          <w:rFonts w:cs="Arial" w:ascii="Arial" w:hAnsi="Arial"/>
+          <w:bCs/>
+        </w:rPr>
+        <w:t>Implementation of minor extra features, requested by the users.</w:t>
       </w:r>
     </w:p>
     <w:p>
@@ -106,7 +380,21 @@
           <w:rFonts w:cs="Arial" w:ascii="Arial" w:hAnsi="Arial"/>
           <w:b/>
         </w:rPr>
-        <w:t>Known defects in IBOS MusicXmlReader version 3.0.0.0</w:t>
+        <w:t xml:space="preserve">Known defects in IBOS MusicXmlReader version </w:t>
+      </w:r>
+      <w:r>
+        <w:rPr>
+          <w:rFonts w:cs="Arial" w:ascii="Arial" w:hAnsi="Arial"/>
+          <w:b/>
+        </w:rPr>
+        <w:t>4</w:t>
+      </w:r>
+      <w:r>
+        <w:rPr>
+          <w:rFonts w:cs="Arial" w:ascii="Arial" w:hAnsi="Arial"/>
+          <w:b/>
+        </w:rPr>
+        <w:t>.0.0.0</w:t>
       </w:r>
     </w:p>
     <w:p>
@@ -187,53 +475,47 @@
           <w:numId w:val="2"/>
         </w:numPr>
         <w:spacing w:lineRule="auto" w:line="252"/>
-        <w:rPr>
-          <w:rFonts w:ascii="Arial" w:hAnsi="Arial" w:cs="Arial"/>
-        </w:rPr>
-      </w:pPr>
-      <w:r>
-        <w:rPr>
-          <w:rFonts w:cs="Arial" w:ascii="Arial" w:hAnsi="Arial"/>
-        </w:rPr>
-        <w:t>The “Extended measure information” facility, introduced by version 3.0.0.0 reports measure information in a very unfriendly style, exemplified by:</w:t>
-      </w:r>
-    </w:p>
-    <w:p>
-      <w:pPr>
-        <w:pStyle w:val="Normal"/>
-        <w:spacing w:lineRule="auto" w:line="252"/>
-        <w:ind w:left="720" w:hanging="0"/>
-        <w:rPr>
-          <w:rFonts w:ascii="Arial" w:hAnsi="Arial" w:cs="Arial"/>
-        </w:rPr>
-      </w:pPr>
-      <w:r>
-        <w:rPr>
-          <w:rFonts w:cs="Arial" w:ascii="Arial" w:hAnsi="Arial"/>
-        </w:rPr>
-        <w:t>“</w:t>
-      </w:r>
-      <w:r>
-        <w:rPr>
-          <w:rFonts w:cs="Arial" w:ascii="Arial" w:hAnsi="Arial"/>
-        </w:rPr>
-        <w:t>Measure 4 + 3 eighth” Instead of “Measure 4 beat 6”</w:t>
-      </w:r>
-    </w:p>
-    <w:p>
-      <w:pPr>
-        <w:pStyle w:val="Normal"/>
-        <w:spacing w:lineRule="auto" w:line="252"/>
-        <w:ind w:left="720" w:hanging="0"/>
-        <w:rPr>
-          <w:rFonts w:ascii="Arial" w:hAnsi="Arial" w:cs="Arial"/>
-        </w:rPr>
-      </w:pPr>
-      <w:r>
-        <w:rPr>
-          <w:rFonts w:cs="Arial" w:ascii="Arial" w:hAnsi="Arial"/>
-        </w:rPr>
-        <w:t>This is a very well-known defect, but time does not allow for a solution in 3.0.0.0.</w:t>
+        <w:rPr/>
+      </w:pPr>
+      <w:r>
+        <w:rPr>
+          <w:rFonts w:cs="Arial" w:ascii="Arial" w:hAnsi="Arial"/>
+        </w:rPr>
+        <w:t>When Generating Braille Music files for complicated MusicXml files the program often generates two or more sequences of part-measure In-Accord notation within the same measure. This should be replaced by as single Full measure In-Accord entry.</w:t>
+      </w:r>
+    </w:p>
+    <w:p>
+      <w:pPr>
+        <w:pStyle w:val="Normal"/>
+        <w:numPr>
+          <w:ilvl w:val="0"/>
+          <w:numId w:val="2"/>
+        </w:numPr>
+        <w:spacing w:lineRule="auto" w:line="252"/>
+        <w:rPr/>
+      </w:pPr>
+      <w:r>
+        <w:rPr>
+          <w:rFonts w:cs="Arial" w:ascii="Arial" w:hAnsi="Arial"/>
+        </w:rPr>
+        <w:t>The order of Braille Music notes within the same beat in the user interface of the program is not always well defined. A well defined ordering relating to part number and pitch is desired.</w:t>
+      </w:r>
+    </w:p>
+    <w:p>
+      <w:pPr>
+        <w:pStyle w:val="Normal"/>
+        <w:numPr>
+          <w:ilvl w:val="0"/>
+          <w:numId w:val="2"/>
+        </w:numPr>
+        <w:spacing w:lineRule="auto" w:line="252"/>
+        <w:rPr/>
+      </w:pPr>
+      <w:r>
+        <w:rPr>
+          <w:rFonts w:cs="Arial" w:ascii="Arial" w:hAnsi="Arial"/>
+        </w:rPr>
+        <w:t>The reporting of “enharmonic pitch” for instance the pitch of “B# as “C” and “E#” as “F”  is not correct. Should be changed to “Bis” and “Eis” respectively.</w:t>
       </w:r>
     </w:p>
     <w:p>
@@ -286,6 +568,7 @@
     </w:r>
     <w:r>
       <w:rPr/>
+      <w:t>Release Notes for IBOS MusicXmlReader version 4.0.0.0.docx</w:t>
     </w:r>
     <w:r>
       <w:rPr/>
@@ -620,7 +903,7 @@
     <w:pPr>
       <w:widowControl/>
       <w:bidi w:val="0"/>
-      <w:spacing w:lineRule="auto" w:line="254" w:before="0" w:after="160"/>
+      <w:spacing w:lineRule="auto" w:line="252" w:before="0" w:after="160"/>
       <w:jc w:val="left"/>
     </w:pPr>
     <w:rPr>

</xml_diff>

<commit_message>
Mentioned Corine and Bert in release notes
</commit_message>
<xml_diff>
--- a/Documentation/Official Documentation/Release Notes/Release Notes for IBOS MusicXmlReader version 4.0.0.0.docx
+++ b/Documentation/Official Documentation/Release Notes/Release Notes for IBOS MusicXmlReader version 4.0.0.0.docx
@@ -137,28 +137,7 @@
           <w:rFonts w:cs="Arial" w:ascii="Arial" w:hAnsi="Arial"/>
           <w:bCs/>
         </w:rPr>
-        <w:t>Direct embossing of Braille Music files generated using a Windows Print-dialog</w:t>
-      </w:r>
-      <w:r>
-        <w:rPr>
-          <w:rFonts w:cs="Arial" w:ascii="Arial" w:hAnsi="Arial"/>
-          <w:bCs/>
-        </w:rPr>
-        <w:t>ue</w:t>
-      </w:r>
-      <w:r>
-        <w:rPr>
-          <w:rFonts w:cs="Arial" w:ascii="Arial" w:hAnsi="Arial"/>
-          <w:bCs/>
-        </w:rPr>
-        <w:t xml:space="preserve">. </w:t>
-      </w:r>
-      <w:r>
-        <w:rPr>
-          <w:rFonts w:cs="Arial" w:ascii="Arial" w:hAnsi="Arial"/>
-          <w:bCs/>
-        </w:rPr>
-        <w:t>To be preferred when the embosser can be registered as a Windows printer.</w:t>
+        <w:t>Direct embossing of Braille Music files generated using a Windows Print-dialogue. To be preferred when the embosser can be registered as a Windows printer.</w:t>
       </w:r>
     </w:p>
     <w:p>
@@ -295,17 +274,32 @@
           <w:numId w:val="1"/>
         </w:numPr>
         <w:spacing w:lineRule="auto" w:line="252"/>
-        <w:rPr>
-          <w:rFonts w:ascii="Arial" w:hAnsi="Arial" w:cs="Arial"/>
-          <w:bCs/>
-        </w:rPr>
-      </w:pPr>
-      <w:r>
-        <w:rPr>
-          <w:rFonts w:cs="Arial" w:ascii="Arial" w:hAnsi="Arial"/>
-          <w:bCs/>
-        </w:rPr>
-        <w:t>Localization to Dutch.</w:t>
+        <w:rPr/>
+      </w:pPr>
+      <w:r>
+        <w:rPr>
+          <w:rFonts w:cs="Arial" w:ascii="Arial" w:hAnsi="Arial"/>
+          <w:bCs/>
+        </w:rPr>
+        <w:t xml:space="preserve">Localization to Dutch: </w:t>
+      </w:r>
+      <w:r>
+        <w:rPr>
+          <w:rFonts w:cs="Arial" w:ascii="Arial" w:hAnsi="Arial"/>
+          <w:bCs/>
+          <w:sz w:val="22"/>
+          <w:szCs w:val="22"/>
+        </w:rPr>
+        <w:t>T</w:t>
+      </w:r>
+      <w:r>
+        <w:rPr>
+          <w:rFonts w:cs="Arial" w:ascii="Arial" w:hAnsi="Arial"/>
+          <w:bCs/>
+          <w:sz w:val="22"/>
+          <w:szCs w:val="22"/>
+        </w:rPr>
+        <w:t>ranslation by Corine and Bert from Apeldoorn.</w:t>
       </w:r>
     </w:p>
     <w:p>
@@ -316,10 +310,7 @@
           <w:numId w:val="1"/>
         </w:numPr>
         <w:spacing w:lineRule="auto" w:line="252"/>
-        <w:rPr>
-          <w:rFonts w:ascii="Arial" w:hAnsi="Arial" w:cs="Arial"/>
-          <w:bCs/>
-        </w:rPr>
+        <w:rPr/>
       </w:pPr>
       <w:r>
         <w:rPr>
@@ -380,21 +371,7 @@
           <w:rFonts w:cs="Arial" w:ascii="Arial" w:hAnsi="Arial"/>
           <w:b/>
         </w:rPr>
-        <w:t xml:space="preserve">Known defects in IBOS MusicXmlReader version </w:t>
-      </w:r>
-      <w:r>
-        <w:rPr>
-          <w:rFonts w:cs="Arial" w:ascii="Arial" w:hAnsi="Arial"/>
-          <w:b/>
-        </w:rPr>
-        <w:t>4</w:t>
-      </w:r>
-      <w:r>
-        <w:rPr>
-          <w:rFonts w:cs="Arial" w:ascii="Arial" w:hAnsi="Arial"/>
-          <w:b/>
-        </w:rPr>
-        <w:t>.0.0.0</w:t>
+        <w:t>Known defects in IBOS MusicXmlReader version 4.0.0.0</w:t>
       </w:r>
     </w:p>
     <w:p>
@@ -1082,6 +1059,75 @@
     <w:qFormat/>
     <w:rPr/>
   </w:style>
+  <w:style w:type="character" w:styleId="CITE">
+    <w:name w:val="CITE"/>
+    <w:qFormat/>
+    <w:rPr>
+      <w:i/>
+    </w:rPr>
+  </w:style>
+  <w:style w:type="character" w:styleId="CODE">
+    <w:name w:val="CODE"/>
+    <w:qFormat/>
+    <w:rPr>
+      <w:rFonts w:ascii="Courier New" w:hAnsi="Courier New"/>
+      <w:sz w:val="20"/>
+    </w:rPr>
+  </w:style>
+  <w:style w:type="character" w:styleId="FollowedHyperlink">
+    <w:name w:val="FollowedHyperlink"/>
+    <w:qFormat/>
+    <w:rPr>
+      <w:color w:val="800080"/>
+      <w:u w:val="single"/>
+    </w:rPr>
+  </w:style>
+  <w:style w:type="character" w:styleId="Keyboard">
+    <w:name w:val="Keyboard"/>
+    <w:qFormat/>
+    <w:rPr>
+      <w:rFonts w:ascii="Courier New" w:hAnsi="Courier New"/>
+      <w:b/>
+      <w:sz w:val="20"/>
+    </w:rPr>
+  </w:style>
+  <w:style w:type="character" w:styleId="Sample">
+    <w:name w:val="Sample"/>
+    <w:qFormat/>
+    <w:rPr>
+      <w:rFonts w:ascii="Courier New" w:hAnsi="Courier New"/>
+    </w:rPr>
+  </w:style>
+  <w:style w:type="character" w:styleId="Strong">
+    <w:name w:val="Strong"/>
+    <w:qFormat/>
+    <w:rPr>
+      <w:b/>
+    </w:rPr>
+  </w:style>
+  <w:style w:type="character" w:styleId="Typewriter">
+    <w:name w:val="Typewriter"/>
+    <w:qFormat/>
+    <w:rPr>
+      <w:rFonts w:ascii="Courier New" w:hAnsi="Courier New"/>
+      <w:sz w:val="20"/>
+    </w:rPr>
+  </w:style>
+  <w:style w:type="character" w:styleId="HTMLMarkup">
+    <w:name w:val="HTML Markup"/>
+    <w:qFormat/>
+    <w:rPr>
+      <w:vanish/>
+      <w:color w:val="FF0000"/>
+    </w:rPr>
+  </w:style>
+  <w:style w:type="character" w:styleId="Comment">
+    <w:name w:val="Comment"/>
+    <w:qFormat/>
+    <w:rPr>
+      <w:vanish/>
+    </w:rPr>
+  </w:style>
   <w:style w:type="paragraph" w:styleId="Overskrift">
     <w:name w:val="Overskrift"/>
     <w:basedOn w:val="Normal"/>
@@ -1189,6 +1235,194 @@
     </w:pPr>
     <w:rPr/>
   </w:style>
+  <w:style w:type="paragraph" w:styleId="DefinitionTerm">
+    <w:name w:val="Definition Term"/>
+    <w:basedOn w:val="Normal"/>
+    <w:qFormat/>
+    <w:pPr/>
+    <w:rPr/>
+  </w:style>
+  <w:style w:type="paragraph" w:styleId="DefinitionList">
+    <w:name w:val="Definition List"/>
+    <w:basedOn w:val="Normal"/>
+    <w:qFormat/>
+    <w:pPr>
+      <w:ind w:left="360" w:hanging="0"/>
+    </w:pPr>
+    <w:rPr/>
+  </w:style>
+  <w:style w:type="paragraph" w:styleId="H1">
+    <w:name w:val="H1"/>
+    <w:basedOn w:val="Normal"/>
+    <w:qFormat/>
+    <w:pPr>
+      <w:keepNext w:val="true"/>
+      <w:spacing w:before="100" w:after="100"/>
+      <w:outlineLvl w:val="1"/>
+    </w:pPr>
+    <w:rPr>
+      <w:b/>
+      <w:kern w:val="2"/>
+      <w:sz w:val="48"/>
+    </w:rPr>
+  </w:style>
+  <w:style w:type="paragraph" w:styleId="H2">
+    <w:name w:val="H2"/>
+    <w:basedOn w:val="Normal"/>
+    <w:qFormat/>
+    <w:pPr>
+      <w:keepNext w:val="true"/>
+      <w:spacing w:before="100" w:after="100"/>
+      <w:outlineLvl w:val="2"/>
+    </w:pPr>
+    <w:rPr>
+      <w:b/>
+      <w:sz w:val="36"/>
+    </w:rPr>
+  </w:style>
+  <w:style w:type="paragraph" w:styleId="H3">
+    <w:name w:val="H3"/>
+    <w:basedOn w:val="Normal"/>
+    <w:qFormat/>
+    <w:pPr>
+      <w:keepNext w:val="true"/>
+      <w:spacing w:before="100" w:after="100"/>
+      <w:outlineLvl w:val="3"/>
+    </w:pPr>
+    <w:rPr>
+      <w:b/>
+      <w:sz w:val="28"/>
+    </w:rPr>
+  </w:style>
+  <w:style w:type="paragraph" w:styleId="H4">
+    <w:name w:val="H4"/>
+    <w:basedOn w:val="Normal"/>
+    <w:qFormat/>
+    <w:pPr>
+      <w:keepNext w:val="true"/>
+      <w:spacing w:before="100" w:after="100"/>
+      <w:outlineLvl w:val="4"/>
+    </w:pPr>
+    <w:rPr>
+      <w:b/>
+      <w:sz w:val="24"/>
+    </w:rPr>
+  </w:style>
+  <w:style w:type="paragraph" w:styleId="H5">
+    <w:name w:val="H5"/>
+    <w:basedOn w:val="Normal"/>
+    <w:qFormat/>
+    <w:pPr>
+      <w:keepNext w:val="true"/>
+      <w:spacing w:before="100" w:after="100"/>
+      <w:outlineLvl w:val="5"/>
+    </w:pPr>
+    <w:rPr>
+      <w:b/>
+      <w:sz w:val="20"/>
+    </w:rPr>
+  </w:style>
+  <w:style w:type="paragraph" w:styleId="H6">
+    <w:name w:val="H6"/>
+    <w:basedOn w:val="Normal"/>
+    <w:qFormat/>
+    <w:pPr>
+      <w:keepNext w:val="true"/>
+      <w:spacing w:before="100" w:after="100"/>
+      <w:outlineLvl w:val="6"/>
+    </w:pPr>
+    <w:rPr>
+      <w:b/>
+      <w:sz w:val="16"/>
+    </w:rPr>
+  </w:style>
+  <w:style w:type="paragraph" w:styleId="Address">
+    <w:name w:val="Address"/>
+    <w:basedOn w:val="Normal"/>
+    <w:qFormat/>
+    <w:pPr/>
+    <w:rPr>
+      <w:i/>
+    </w:rPr>
+  </w:style>
+  <w:style w:type="paragraph" w:styleId="Blockquote">
+    <w:name w:val="Blockquote"/>
+    <w:basedOn w:val="Normal"/>
+    <w:qFormat/>
+    <w:pPr>
+      <w:spacing w:before="100" w:after="100"/>
+      <w:ind w:left="360" w:right="360" w:hanging="0"/>
+    </w:pPr>
+    <w:rPr/>
+  </w:style>
+  <w:style w:type="paragraph" w:styleId="Preformatted">
+    <w:name w:val="Preformatted"/>
+    <w:basedOn w:val="Normal"/>
+    <w:qFormat/>
+    <w:pPr>
+      <w:tabs>
+        <w:tab w:val="clear" w:pos="720"/>
+        <w:tab w:val="left" w:pos="0" w:leader="none"/>
+        <w:tab w:val="left" w:pos="959" w:leader="none"/>
+        <w:tab w:val="left" w:pos="1918" w:leader="none"/>
+        <w:tab w:val="left" w:pos="2877" w:leader="none"/>
+        <w:tab w:val="left" w:pos="3836" w:leader="none"/>
+        <w:tab w:val="left" w:pos="4795" w:leader="none"/>
+        <w:tab w:val="left" w:pos="5754" w:leader="none"/>
+        <w:tab w:val="left" w:pos="6713" w:leader="none"/>
+        <w:tab w:val="left" w:pos="7672" w:leader="none"/>
+        <w:tab w:val="left" w:pos="8631" w:leader="none"/>
+        <w:tab w:val="left" w:pos="9590" w:leader="none"/>
+      </w:tabs>
+      <w:spacing w:before="0" w:after="0"/>
+    </w:pPr>
+    <w:rPr>
+      <w:rFonts w:ascii="Courier New" w:hAnsi="Courier New"/>
+      <w:sz w:val="20"/>
+    </w:rPr>
+  </w:style>
+  <w:style w:type="paragraph" w:styleId="ZBottomofForm">
+    <w:name w:val="z-Bottom of Form"/>
+    <w:qFormat/>
+    <w:pPr>
+      <w:widowControl/>
+      <w:pBdr>
+        <w:top w:val="double" w:sz="2" w:space="0" w:color="000000"/>
+      </w:pBdr>
+      <w:bidi w:val="0"/>
+      <w:jc w:val="center"/>
+    </w:pPr>
+    <w:rPr>
+      <w:rFonts w:ascii="Arial" w:hAnsi="Arial" w:eastAsia="Arial" w:cs="Courier New"/>
+      <w:vanish/>
+      <w:color w:val="auto"/>
+      <w:kern w:val="0"/>
+      <w:sz w:val="16"/>
+      <w:szCs w:val="24"/>
+      <w:lang w:val="da-DK" w:eastAsia="zh-CN" w:bidi="hi-IN"/>
+    </w:rPr>
+  </w:style>
+  <w:style w:type="paragraph" w:styleId="ZTopofForm">
+    <w:name w:val="z-Top of Form"/>
+    <w:qFormat/>
+    <w:pPr>
+      <w:widowControl/>
+      <w:pBdr>
+        <w:bottom w:val="double" w:sz="2" w:space="0" w:color="000000"/>
+      </w:pBdr>
+      <w:bidi w:val="0"/>
+      <w:jc w:val="center"/>
+    </w:pPr>
+    <w:rPr>
+      <w:rFonts w:ascii="Arial" w:hAnsi="Arial" w:eastAsia="Arial" w:cs="Courier New"/>
+      <w:vanish/>
+      <w:color w:val="auto"/>
+      <w:kern w:val="0"/>
+      <w:sz w:val="16"/>
+      <w:szCs w:val="24"/>
+      <w:lang w:val="da-DK" w:eastAsia="zh-CN" w:bidi="hi-IN"/>
+    </w:rPr>
+  </w:style>
   <w:style w:type="numbering" w:styleId="WW8Num1">
     <w:name w:val="WW8Num1"/>
     <w:qFormat/>

</xml_diff>